<commit_message>
Ultima evaluación de genencia
</commit_message>
<xml_diff>
--- a/Gerencia de la informática/Unidad 4/Investigación de exposición grupal, Gerencia, IF01 T4 intensivos.docx
+++ b/Gerencia de la informática/Unidad 4/Investigación de exposición grupal, Gerencia, IF01 T4 intensivos.docx
@@ -1317,7 +1317,7 @@
           <w:rFonts w:eastAsia="Times New Roman"/>
           <w:lang w:eastAsia="es-VE"/>
         </w:rPr>
-        <w:t>La gerencia de los recursos humanos constituye un pilar fundamental en cualquier organización, y su relevancia se acentúa en el ámbito de la informática debido a la naturaleza dinámica, especializada y estratégica de esta disciplina. A diferencia de otros sectores, el área informática depende en gran medida del capital humano como principal recurso productivo, ya que el conocimiento, la innovación y las competencias técnicas de los profesionales son los que permiten desarrollar, mantener y optimizar sistemas de información, infraestructuras tecnológicas y soluciones digitales.</w:t>
+        <w:t xml:space="preserve">La gerencia de los recursos humanos constituye un pilar fundamental en cualquier organización, y su relevancia se acentúa en el ámbito de la informática debido a la naturaleza dinámica, especializada y estratégica de esta disciplina. </w:t>
       </w:r>
     </w:p>
     <w:p>
@@ -1387,7 +1387,7 @@
           <w:szCs w:val="24"/>
           <w:lang w:eastAsia="es-VE"/>
         </w:rPr>
-        <w:t>: La informática es un campo altamente competitivo donde las empresas requieren profesionales con competencias actualizadas. Una gestión adecuada permite reclutar perfiles idóneos y diseñar estrategias que favorezcan la permanencia del talento.</w:t>
+        <w:t xml:space="preserve">: La informática es un campo altamente competitivo donde las empresas requieren profesionales con competencias actualizadas. </w:t>
       </w:r>
     </w:p>
     <w:p>
@@ -1424,7 +1424,7 @@
           <w:szCs w:val="24"/>
           <w:lang w:eastAsia="es-VE"/>
         </w:rPr>
-        <w:t>: El entorno tecnológico evoluciona rápidamente, lo que obliga a capacitar de forma continua a los trabajadores. La gerencia de recursos humanos debe planificar y ejecutar programas de formación para asegurar que el personal se mantenga actualizado.</w:t>
+        <w:t>: El entorno tecnológico evoluciona rápidamente, lo que obliga a capacitar de forma continua a los trabajadores.</w:t>
       </w:r>
     </w:p>
     <w:p>
@@ -1461,7 +1461,16 @@
           <w:szCs w:val="24"/>
           <w:lang w:eastAsia="es-VE"/>
         </w:rPr>
-        <w:t>: La gestión del capital humano permite coordinar adecuadamente a los equipos de trabajo, estableciendo roles, responsabilidades y objetivos claros que se traducen en mayor eficiencia y cumplimiento de plazos en proyectos tecnológicos.</w:t>
+        <w:t>: La gestión del capital humano permite coordinar adecuadamente a los equipos de trabajo, estableciendo roles, responsabilidades y objetivos claros que se traducen en mayor eficiencia</w:t>
+      </w:r>
+      <w:r>
+        <w:rPr>
+          <w:rFonts w:ascii="Times New Roman" w:eastAsia="Times New Roman" w:hAnsi="Times New Roman" w:cs="Times New Roman"/>
+          <w:sz w:val="24"/>
+          <w:szCs w:val="24"/>
+          <w:lang w:eastAsia="es-VE"/>
+        </w:rPr>
+        <w:t>.</w:t>
       </w:r>
     </w:p>
     <w:p>
@@ -1535,17 +1544,7 @@
           <w:szCs w:val="24"/>
           <w:lang w:eastAsia="es-VE"/>
         </w:rPr>
-        <w:t xml:space="preserve">: Los recursos humanos no solo cumplen funciones técnicas, sino que también contribuyen a los objetivos estratégicos de la organización. Una gerencia </w:t>
-      </w:r>
-      <w:r>
-        <w:rPr>
-          <w:rFonts w:ascii="Times New Roman" w:eastAsia="Times New Roman" w:hAnsi="Times New Roman" w:cs="Times New Roman"/>
-          <w:sz w:val="24"/>
-          <w:szCs w:val="24"/>
-          <w:lang w:eastAsia="es-VE"/>
-        </w:rPr>
-        <w:lastRenderedPageBreak/>
-        <w:t>efectiva asegura que el talento informático trabaje en sintonía con la misión, visión y metas corporativas.</w:t>
+        <w:t>: Los recursos humanos no solo cumplen funciones técnicas, sino que también contribuyen a los objetivos estratégicos de la organización. informático trabaje en sintonía con la misión, visión y metas corporativas.</w:t>
       </w:r>
     </w:p>
     <w:p>
@@ -1661,6 +1660,7 @@
           <w:szCs w:val="24"/>
           <w:lang w:eastAsia="es-VE"/>
         </w:rPr>
+        <w:lastRenderedPageBreak/>
         <w:t>Desarrollar una cultura organizacional orientada a la mejora continua y la adaptabilidad tecnológica.</w:t>
       </w:r>
     </w:p>
@@ -1718,10 +1718,13 @@
           <w:b w:val="0"/>
           <w:bCs w:val="0"/>
         </w:rPr>
-        <w:t>habilidades técnicas, interpersonales y estratégicas</w:t>
-      </w:r>
-      <w:r>
-        <w:t xml:space="preserve"> que le permitan liderar equipos especializados en un entorno dinámico y altamente competitivo.</w:t>
+        <w:t>habilidades</w:t>
+      </w:r>
+      <w:r>
+        <w:t>.</w:t>
+      </w:r>
+      <w:r>
+        <w:t xml:space="preserve"> Estas son:</w:t>
       </w:r>
     </w:p>
     <w:p>
@@ -1797,17 +1800,7 @@
           <w:szCs w:val="28"/>
           <w:lang w:eastAsia="es-VE"/>
         </w:rPr>
-        <w:t xml:space="preserve"> el gerente de recursos humanos debe tener una comprensión básica de los diferentes roles dentro del departamento de TI, tales como desarrolladores de software, administradores de redes, analistas de datos, entre otros. Esto le permite identificar las habilidades específicas que se </w:t>
-      </w:r>
-      <w:r>
-        <w:rPr>
-          <w:rFonts w:ascii="Times New Roman" w:eastAsia="Times New Roman" w:hAnsi="Times New Roman" w:cs="Times New Roman"/>
-          <w:sz w:val="24"/>
-          <w:szCs w:val="28"/>
-          <w:lang w:eastAsia="es-VE"/>
-        </w:rPr>
-        <w:lastRenderedPageBreak/>
-        <w:t>requieren para cada puesto y cómo se interrelacionan dentro de los proyectos tecnológicos de la organización. Además, tener esta comprensión facilita la comunicación efectiva con los equipos técnicos y permite una gestión más eficiente de los recursos humanos, al saber exactamente qué competencias son necesarias para alcanzar los objetivos organizacionales.</w:t>
+        <w:t xml:space="preserve"> el gerente de recursos humanos debe tener una comprensión básica de los diferentes roles dentro del departamento de TI, tales como desarrolladores de software, administradores de redes, analistas de datos, entre otros. Esto le permite identificar las habilidades específicas que se requieren para cada puesto y cómo se interrelacionan dentro de los proyectos tecnológicos de la organización. Además, tener esta comprensión facilita la comunicación efectiva con los equipos técnicos y permite una gestión más eficiente de los recursos humanos, al saber exactamente qué competencias son necesarias para alcanzar los objetivos organizacionales.</w:t>
       </w:r>
     </w:p>
     <w:p>
@@ -1844,7 +1837,17 @@
           <w:szCs w:val="28"/>
           <w:lang w:eastAsia="es-VE"/>
         </w:rPr>
-        <w:t xml:space="preserve"> un gerente de recursos humanos con conocimientos básicos en tecnología es más capaz de identificar y evaluar las habilidades técnicas necesarias en los candidatos. Esto no solo incluye conocimientos en lenguajes de programación o gestión de bases de datos, sino también en herramientas y plataformas tecnológicas que son esenciales para la empresa. Al poder comprender los requisitos técnicos de los roles, el gerente puede realizar entrevistas más efectivas, evaluar con precisión los currículos de los candidatos y tomar decisiones de contratación que garanticen que el personal seleccionado esté alineado con las necesidades tecnológicas de la empresa. Además, esto permite realizar una selección más estratégica, no solo en términos de conocimientos técnicos, sino también evaluando si los candidatos tienen la capacidad de adaptarse a un entorno tecnológico en constante cambio.</w:t>
+        <w:t xml:space="preserve"> un gerente de recursos humanos con conocimientos básicos en tecnología es más capaz de identificar y evaluar las habilidades técnicas necesarias en los candidatos. Esto no solo incluye conocimientos en lenguajes de programación o gestión de bases de datos, sino también en herramientas y plataformas tecnológicas que son esenciales para la empresa. Al poder </w:t>
+      </w:r>
+      <w:r>
+        <w:rPr>
+          <w:rFonts w:ascii="Times New Roman" w:eastAsia="Times New Roman" w:hAnsi="Times New Roman" w:cs="Times New Roman"/>
+          <w:sz w:val="24"/>
+          <w:szCs w:val="28"/>
+          <w:lang w:eastAsia="es-VE"/>
+        </w:rPr>
+        <w:lastRenderedPageBreak/>
+        <w:t>comprender los requisitos técnicos de los roles, el gerente puede realizar entrevistas más efectivas, evaluar con precisión los currículos de los candidatos y tomar decisiones de contratación que garanticen que el personal seleccionado esté alineado con las necesidades tecnológicas de la empresa. Además, esto permite realizar una selección más estratégica, no solo en términos de conocimientos técnicos, sino también evaluando si los candidatos tienen la capacidad de adaptarse a un entorno tecnológico en constante cambio.</w:t>
       </w:r>
     </w:p>
     <w:p>
@@ -1946,7 +1949,6 @@
           <w:szCs w:val="28"/>
           <w:lang w:eastAsia="es-VE"/>
         </w:rPr>
-        <w:lastRenderedPageBreak/>
         <w:t>Fomentar el desarrollo profesional continuo:</w:t>
       </w:r>
       <w:r>
@@ -1984,6 +1986,7 @@
           <w:szCs w:val="28"/>
           <w:lang w:eastAsia="es-VE"/>
         </w:rPr>
+        <w:lastRenderedPageBreak/>
         <w:t>Facilitar la toma de decisiones estratégicas en relación con las tecnologías emergentes:</w:t>
       </w:r>
       <w:r>
@@ -2088,8 +2091,9 @@
           <w:szCs w:val="28"/>
           <w:lang w:eastAsia="es-VE"/>
         </w:rPr>
-        <w:t xml:space="preserve"> la capacidad de transmitir ideas, expectativas y retroalimentación de manera clara y comprensible es fundamental para garantizar que todos los miembros del </w:t>
-      </w:r>
+        <w:t xml:space="preserve"> la capacidad de transmitir ideas, expectativas y retroalimentación de manera clara y comprensible es fundamental para garantizar que todos los miembros del equipo estén alineados y comprendan sus responsabilidades. En el contexto de la informática, donde el lenguaje técnico puede ser complejo y las tareas a menudo dependen de una coordinación precisa, una comunicación efectiva ayuda a reducir la ambigüedad y los malentendidos. Un gerente debe ser capaz de adaptar su estilo de comunicación según la audiencia, ya sea explicando conceptos técnicos a otros departamentos no técnicos o simplificando instrucciones complejas para los miembros del equipo. Además, debe saber escuchar activamente y proporcionar un </w:t>
+      </w:r>
+      <w:proofErr w:type="spellStart"/>
       <w:r>
         <w:rPr>
           <w:rFonts w:ascii="Times New Roman" w:eastAsia="Times New Roman" w:hAnsi="Times New Roman" w:cs="Times New Roman"/>
@@ -2097,8 +2101,17 @@
           <w:szCs w:val="28"/>
           <w:lang w:eastAsia="es-VE"/>
         </w:rPr>
-        <w:lastRenderedPageBreak/>
-        <w:t>equipo estén alineados y comprendan sus responsabilidades. En el contexto de la informática, donde el lenguaje técnico puede ser complejo y las tareas a menudo dependen de una coordinación precisa, una comunicación efectiva ayuda a reducir la ambigüedad y los malentendidos. Un gerente debe ser capaz de adaptar su estilo de comunicación según la audiencia, ya sea explicando conceptos técnicos a otros departamentos no técnicos o simplificando instrucciones complejas para los miembros del equipo. Además, debe saber escuchar activamente y proporcionar un feedback constructivo que fomente el crecimiento personal y profesional de los empleados.</w:t>
+        <w:t>feedback</w:t>
+      </w:r>
+      <w:proofErr w:type="spellEnd"/>
+      <w:r>
+        <w:rPr>
+          <w:rFonts w:ascii="Times New Roman" w:eastAsia="Times New Roman" w:hAnsi="Times New Roman" w:cs="Times New Roman"/>
+          <w:sz w:val="24"/>
+          <w:szCs w:val="28"/>
+          <w:lang w:eastAsia="es-VE"/>
+        </w:rPr>
+        <w:t xml:space="preserve"> constructivo que fomente el crecimiento personal y profesional de los empleados.</w:t>
       </w:r>
     </w:p>
     <w:p>
@@ -2126,6 +2139,7 @@
           <w:szCs w:val="28"/>
           <w:lang w:eastAsia="es-VE"/>
         </w:rPr>
+        <w:lastRenderedPageBreak/>
         <w:t>Liderazgo:</w:t>
       </w:r>
       <w:r>
@@ -2200,17 +2214,26 @@
           <w:szCs w:val="28"/>
           <w:lang w:eastAsia="es-VE"/>
         </w:rPr>
+        <w:t>Resolución de conflictos:</w:t>
+      </w:r>
+      <w:r>
+        <w:rPr>
+          <w:rFonts w:ascii="Times New Roman" w:eastAsia="Times New Roman" w:hAnsi="Times New Roman" w:cs="Times New Roman"/>
+          <w:sz w:val="24"/>
+          <w:szCs w:val="28"/>
+          <w:lang w:eastAsia="es-VE"/>
+        </w:rPr>
+        <w:t xml:space="preserve"> en cualquier equipo de trabajo, es inevitable que surjan conflictos de vez en cuando. Estos pueden ser causados por diferencias de opinión, problemas de comunicación, o incluso presiones externas como plazos ajustados o recursos limitados. En un entorno altamente colaborativo como el de la informática, donde los proyectos requieren trabajo conjunto y la toma de decisiones en equipo, es fundamental que el gerente tenga habilidades para manejar disputas internas de manera efectiva. Esto incluye escuchar todas las partes involucradas, comprender las raíces del conflicto, y encontrar soluciones que no solo resuelvan el problema, sino que también mantengan la productividad y el bienestar del equipo. La capacidad de resolver conflictos de manera </w:t>
+      </w:r>
+      <w:r>
+        <w:rPr>
+          <w:rFonts w:ascii="Times New Roman" w:eastAsia="Times New Roman" w:hAnsi="Times New Roman" w:cs="Times New Roman"/>
+          <w:sz w:val="24"/>
+          <w:szCs w:val="28"/>
+          <w:lang w:eastAsia="es-VE"/>
+        </w:rPr>
         <w:lastRenderedPageBreak/>
-        <w:t>Resolución de conflictos:</w:t>
-      </w:r>
-      <w:r>
-        <w:rPr>
-          <w:rFonts w:ascii="Times New Roman" w:eastAsia="Times New Roman" w:hAnsi="Times New Roman" w:cs="Times New Roman"/>
-          <w:sz w:val="24"/>
-          <w:szCs w:val="28"/>
-          <w:lang w:eastAsia="es-VE"/>
-        </w:rPr>
-        <w:t xml:space="preserve"> en cualquier equipo de trabajo, es inevitable que surjan conflictos de vez en cuando. Estos pueden ser causados por diferencias de opinión, problemas de comunicación, o incluso presiones externas como plazos ajustados o recursos limitados. En un entorno altamente colaborativo como el de la informática, donde los proyectos requieren trabajo conjunto y la toma de decisiones en equipo, es fundamental que el gerente tenga habilidades para manejar disputas internas de manera efectiva. Esto incluye escuchar todas las partes involucradas, comprender las raíces del conflicto, y encontrar soluciones que no solo resuelvan el problema, sino que también mantengan la productividad y el bienestar del equipo. La capacidad de resolver conflictos de manera justa y respetuosa evita que los problemas se conviertan en obstáculos mayores que puedan afectar la moral del equipo y retrasar el progreso de los proyectos.</w:t>
+        <w:t>justa y respetuosa evita que los problemas se conviertan en obstáculos mayores que puedan afectar la moral del equipo y retrasar el progreso de los proyectos.</w:t>
       </w:r>
     </w:p>
     <w:p/>
@@ -2326,17 +2349,7 @@
           <w:szCs w:val="28"/>
           <w:lang w:eastAsia="es-VE"/>
         </w:rPr>
-        <w:t xml:space="preserve"> la planeación estratégica es uno de los pilares fundamentales en la gestión de recursos humanos dentro de un contexto tecnológico. Un gerente debe ser capaz de diseñar estructuras de trabajo eficientes que no solo optimicen el uso del tiempo y los recursos, sino que también se adapten a las necesidades cambiantes de los proyectos tecnológicos. Esto implica asignar recursos humanos de manera adecuada, asegurando que cada miembro del equipo tenga las habilidades y el enfoque correcto para las tareas específicas. Además, la planificación de proyectos debe ser realista, considerando tiempos de entrega, la disponibilidad de herramientas tecnológicas y la carga de trabajo del equipo. La organización también juega un papel importante en la gestión de equipos multidisciplinarios, ya que los proyectos informáticos suelen requerir la colaboración de </w:t>
-      </w:r>
-      <w:r>
-        <w:rPr>
-          <w:rFonts w:ascii="Times New Roman" w:eastAsia="Times New Roman" w:hAnsi="Times New Roman" w:cs="Times New Roman"/>
-          <w:sz w:val="24"/>
-          <w:szCs w:val="28"/>
-          <w:lang w:eastAsia="es-VE"/>
-        </w:rPr>
-        <w:lastRenderedPageBreak/>
-        <w:t>diferentes áreas de la empresa, como programación, diseño, pruebas y soporte. El gerente debe ser capaz de coordinar todas estas áreas de manera que se optimicen los esfuerzos y recursos.</w:t>
+        <w:t xml:space="preserve"> la planeación estratégica es uno de los pilares fundamentales en la gestión de recursos humanos dentro de un contexto tecnológico. Un gerente debe ser capaz de diseñar estructuras de trabajo eficientes que no solo optimicen el uso del tiempo y los recursos, sino que también se adapten a las necesidades cambiantes de los proyectos tecnológicos. Esto implica asignar recursos humanos de manera adecuada, asegurando que cada miembro del equipo tenga las habilidades y el enfoque correcto para las tareas específicas. Además, la planificación de proyectos debe ser realista, considerando tiempos de entrega, la disponibilidad de herramientas tecnológicas y la carga de trabajo del equipo. La organización también juega un papel importante en la gestión de equipos multidisciplinarios, ya que los proyectos informáticos suelen requerir la colaboración de diferentes áreas de la empresa, como programación, diseño, pruebas y soporte. El gerente debe ser capaz de coordinar todas estas áreas de manera que se optimicen los esfuerzos y recursos.</w:t>
       </w:r>
     </w:p>
     <w:p>
@@ -2373,7 +2386,17 @@
           <w:szCs w:val="28"/>
           <w:lang w:eastAsia="es-VE"/>
         </w:rPr>
-        <w:t xml:space="preserve"> un gerente de recursos humanos debe ser capaz de evaluar diversas opciones y tomar decisiones que no solo beneficien a la organización a corto plazo, sino que también contribuyan al desarrollo del equipo y al cumplimiento de los objetivos empresariales a largo plazo. En el ámbito de la informática, esto puede implicar decisiones sobre qué tecnologías adoptar, qué talento contratar o cómo rediseñar los equipos de trabajo para afrontar nuevos desafíos. Además, las decisiones deben ser fundamentadas en datos y análisis, utilizando indicadores de desempeño que midan la efectividad de las decisiones previas, lo que permitirá ajustar estrategias y mejorar la gestión del talento. La capacidad de tomar decisiones informadas y oportunas es esencial para la dirección efectiva de proyectos que dependen de tiempos y recursos limitados, lo que es común en el sector tecnológico.</w:t>
+        <w:t xml:space="preserve"> un gerente de recursos humanos debe ser capaz de evaluar diversas opciones y tomar decisiones que no solo beneficien a la organización a corto plazo, sino que también contribuyan al desarrollo del equipo y al cumplimiento de los objetivos empresariales a largo plazo. En el ámbito de la informática, esto puede implicar decisiones sobre qué tecnologías adoptar, qué talento contratar o cómo rediseñar los equipos de trabajo para afrontar nuevos desafíos. Además, las decisiones deben ser fundamentadas en datos y </w:t>
+      </w:r>
+      <w:r>
+        <w:rPr>
+          <w:rFonts w:ascii="Times New Roman" w:eastAsia="Times New Roman" w:hAnsi="Times New Roman" w:cs="Times New Roman"/>
+          <w:sz w:val="24"/>
+          <w:szCs w:val="28"/>
+          <w:lang w:eastAsia="es-VE"/>
+        </w:rPr>
+        <w:lastRenderedPageBreak/>
+        <w:t>análisis, utilizando indicadores de desempeño que midan la efectividad de las decisiones previas, lo que permitirá ajustar estrategias y mejorar la gestión del talento. La capacidad de tomar decisiones informadas y oportunas es esencial para la dirección efectiva de proyectos que dependen de tiempos y recursos limitados, lo que es común en el sector tecnológico.</w:t>
       </w:r>
     </w:p>
     <w:p>
@@ -2447,17 +2470,7 @@
           <w:szCs w:val="28"/>
           <w:lang w:eastAsia="es-VE"/>
         </w:rPr>
-        <w:t xml:space="preserve"> para asegurar que el capital humano esté alineado con los objetivos estratégicos de la organización, el gerente de recursos humanos debe integrar la gestión del talento dentro de la estrategia corporativa global. Esto implica tener una visión estratégica que no solo se enfoque en las necesidades inmediatas, sino también en el crecimiento y la competitividad a largo plazo. Un gerente debe comprender cómo la gestión de recursos humanos puede contribuir a la innovación tecnológica, mejorar los procesos internos y </w:t>
-      </w:r>
-      <w:r>
-        <w:rPr>
-          <w:rFonts w:ascii="Times New Roman" w:eastAsia="Times New Roman" w:hAnsi="Times New Roman" w:cs="Times New Roman"/>
-          <w:sz w:val="24"/>
-          <w:szCs w:val="28"/>
-          <w:lang w:eastAsia="es-VE"/>
-        </w:rPr>
-        <w:lastRenderedPageBreak/>
-        <w:t>fortalecer la cultura organizacional. Al integrar el talento en los planes estratégicos de la empresa, el gerente asegura que los proyectos tecnológicos sean respaldados por equipos capacitados, motivados y comprometidos con los valores y la misión de la organización. Esto requiere una planificación a largo plazo, en la que se identifiquen áreas clave de desarrollo, se establezcan metas claras y se creen estrategias de retención que garanticen la permanencia del talento crítico dentro de la empresa.</w:t>
+        <w:t xml:space="preserve"> para asegurar que el capital humano esté alineado con los objetivos estratégicos de la organización, el gerente de recursos humanos debe integrar la gestión del talento dentro de la estrategia corporativa global. Esto implica tener una visión estratégica que no solo se enfoque en las necesidades inmediatas, sino también en el crecimiento y la competitividad a largo plazo. Un gerente debe comprender cómo la gestión de recursos humanos puede contribuir a la innovación tecnológica, mejorar los procesos internos y fortalecer la cultura organizacional. Al integrar el talento en los planes estratégicos de la empresa, el gerente asegura que los proyectos tecnológicos sean respaldados por equipos capacitados, motivados y comprometidos con los valores y la misión de la organización. Esto requiere una planificación a largo plazo, en la que se identifiquen áreas clave de desarrollo, se establezcan metas claras y se creen estrategias de retención que garanticen la permanencia del talento crítico dentro de la empresa.</w:t>
       </w:r>
     </w:p>
     <w:p/>
@@ -2468,6 +2481,7 @@
       </w:pPr>
       <w:bookmarkStart w:id="5" w:name="_Toc208686048"/>
       <w:r>
+        <w:lastRenderedPageBreak/>
         <w:t xml:space="preserve">Comunicación y </w:t>
       </w:r>
       <w:r>
@@ -2542,15 +2556,7 @@
           <w:rFonts w:eastAsia="Times New Roman"/>
           <w:lang w:eastAsia="es-VE"/>
         </w:rPr>
-        <w:t xml:space="preserve">Por otro lado, la comunicación horizontal juega un papel igualmente importante, ya que se refiere a la interacción entre los miembros del mismo equipo o entre diferentes equipos dentro de la organización. En proyectos informáticos, donde la colaboración y el intercambio de ideas son constantes, esta comunicación horizontal asegura que todos los miembros del equipo trabajen de </w:t>
-      </w:r>
-      <w:r>
-        <w:rPr>
-          <w:rFonts w:eastAsia="Times New Roman"/>
-          <w:lang w:eastAsia="es-VE"/>
-        </w:rPr>
-        <w:lastRenderedPageBreak/>
-        <w:t>manera cohesiva y sin fricciones. Además, permite un flujo de ideas que fomenta la innovación y la creatividad. Un entorno de comunicación abierta y bidireccional contribuye a mejorar la dinámica del equipo, ya que cada miembro puede aportar conocimientos y soluciones, sin temor a jerarquías o restricciones. La capacidad de fomentar esta colaboración en equipos multidisciplinarios es clave, especialmente cuando se trata de proyectos complejos que requieren diferentes perspectivas.</w:t>
+        <w:t>Por otro lado, la comunicación horizontal juega un papel igualmente importante, ya que se refiere a la interacción entre los miembros del mismo equipo o entre diferentes equipos dentro de la organización. En proyectos informáticos, donde la colaboración y el intercambio de ideas son constantes, esta comunicación horizontal asegura que todos los miembros del equipo trabajen de manera cohesiva y sin fricciones. Además, permite un flujo de ideas que fomenta la innovación y la creatividad. Un entorno de comunicación abierta y bidireccional contribuye a mejorar la dinámica del equipo, ya que cada miembro puede aportar conocimientos y soluciones, sin temor a jerarquías o restricciones. La capacidad de fomentar esta colaboración en equipos multidisciplinarios es clave, especialmente cuando se trata de proyectos complejos que requieren diferentes perspectivas.</w:t>
       </w:r>
     </w:p>
     <w:p>
@@ -2575,7 +2581,11 @@
         <w:t>l</w:t>
       </w:r>
       <w:r>
-        <w:t>os empleados deben tener una comprensión clara no solo de las expectativas y los objetivos de los proyectos, sino también del contexto y los recursos disponibles para alcanzar dichos objetivos. La falta de transparencia puede generar confusión, frustración y, en última instancia, desmotivación. Cuando los gerentes proporcionan información precisa y oportuna sobre el estado de los proyectos, las metas alcanzadas y los obstáculos a superar, los miembros del equipo pueden tomar decisiones informadas y sentir que están verdaderamente contribuyendo al progreso. Además, la retroalimentación constante es crucial. Los empleados necesitan recibir comentarios sobre su desempeño de manera regular para poder mejorar y ajustar su enfoque, especialmente en un entorno tecnológico donde las tareas pueden ser altamente técnicas y cambiantes. Esta retroalimentación no debe ser solo correctiva, sino también positiva, reconociendo los logros y el esfuerzo del equipo. Un sistema de retroalimentación efectiva mejora el compromiso y la motivación, elementos fundamentales en el rendimiento de los proyectos informáticos.</w:t>
+        <w:t xml:space="preserve">os empleados deben tener una comprensión clara no solo de las expectativas y los objetivos de los proyectos, sino también del contexto y los recursos disponibles para alcanzar dichos objetivos. La falta de transparencia puede </w:t>
+      </w:r>
+      <w:r>
+        <w:lastRenderedPageBreak/>
+        <w:t>generar confusión, frustración y, en última instancia, desmotivación. Cuando los gerentes proporcionan información precisa y oportuna sobre el estado de los proyectos, las metas alcanzadas y los obstáculos a superar, los miembros del equipo pueden tomar decisiones informadas y sentir que están verdaderamente contribuyendo al progreso. Además, la retroalimentación constante es crucial. Los empleados necesitan recibir comentarios sobre su desempeño de manera regular para poder mejorar y ajustar su enfoque, especialmente en un entorno tecnológico donde las tareas pueden ser altamente técnicas y cambiantes. Esta retroalimentación no debe ser solo correctiva, sino también positiva, reconociendo los logros y el esfuerzo del equipo. Un sistema de retroalimentación efectiva mejora el compromiso y la motivación, elementos fundamentales en el rendimiento de los proyectos informáticos.</w:t>
       </w:r>
     </w:p>
     <w:p>
@@ -2600,7 +2610,15 @@
         <w:t>u</w:t>
       </w:r>
       <w:r>
-        <w:t>n gerente de recursos humanos debe estar familiarizado con una variedad de herramientas digitales que faciliten la comunicación y la colaboración. Plataformas de gestión de proyectos, como Trello, Asana o Jira, permiten que los equipos puedan hacer un seguimiento detallado de los avances, asignar tareas y verificar el progreso sin importar la distancia. Además, las videoconferencias y las reuniones virtuales mediante plataformas como Zoom o Microsoft Teams permiten mantener una interacción constante entre los miembros del equipo, promoviendo la discusión en tiempo real y la toma de decisiones ágil. Esto es especialmente importante cuando los proyectos abarcan varias ubicaciones o equipos multidisciplinarios que necesitan estar coordinados.</w:t>
+        <w:t xml:space="preserve">n gerente de recursos humanos debe estar familiarizado con una variedad de herramientas digitales que faciliten la comunicación y la colaboración. Plataformas de gestión de proyectos, como Trello, Asana o Jira, permiten que los equipos puedan hacer un seguimiento detallado de los avances, asignar tareas y verificar el progreso sin importar la distancia. Además, las videoconferencias y las reuniones virtuales mediante plataformas como Zoom o Microsoft </w:t>
+      </w:r>
+      <w:proofErr w:type="spellStart"/>
+      <w:r>
+        <w:t>Teams</w:t>
+      </w:r>
+      <w:proofErr w:type="spellEnd"/>
+      <w:r>
+        <w:t xml:space="preserve"> permiten mantener una interacción constante entre los miembros del equipo, promoviendo la discusión en tiempo real y la toma de decisiones ágil. Esto es especialmente importante cuando los proyectos abarcan varias ubicaciones o equipos multidisciplinarios que necesitan estar coordinados.</w:t>
       </w:r>
     </w:p>
     <w:p/>
@@ -2681,7 +2699,16 @@
           <w:sz w:val="24"/>
           <w:szCs w:val="24"/>
         </w:rPr>
-        <w:t>ste estilo de liderazgo pone un énfasis importante en inspirar a los empleados para que desarrollen su máximo potencial y se comprometan con un propósito común que va más allá de las tareas diarias. En el contexto de la informática, donde la innovación y la creatividad son vitales para mantenerse competitivo, el liderazgo transformacional es especialmente eficaz. Los líderes que adoptan este enfoque logran crear una visión compartida que motiva a los empleados a superar los desafíos y pensar fuera de lo convencional. En un sector donde los cambios tecnológicos son rápidos y constantes, este tipo de liderazgo fomenta una cultura organizacional que valora la adaptación y la evolución continua. Los líderes transformacionales alientan a los miembros de su equipo a proponer nuevas ideas, experimentar y adoptar nuevas tecnologías sin temor al fracaso, lo cual es crucial para impulsar la innovación dentro de la empresa.</w:t>
+        <w:t xml:space="preserve">ste estilo de liderazgo pone un énfasis importante en inspirar a los empleados para que desarrollen su máximo potencial y se comprometan con un propósito común que va más allá de las tareas diarias. En el contexto de la informática, </w:t>
+      </w:r>
+      <w:r>
+        <w:rPr>
+          <w:rFonts w:ascii="Times New Roman" w:hAnsi="Times New Roman" w:cs="Times New Roman"/>
+          <w:sz w:val="24"/>
+          <w:szCs w:val="24"/>
+        </w:rPr>
+        <w:lastRenderedPageBreak/>
+        <w:t>donde la innovación y la creatividad son vitales para mantenerse competitivo, el liderazgo transformacional es especialmente eficaz. Los líderes que adoptan este enfoque logran crear una visión compartida que motiva a los empleados a superar los desafíos y pensar fuera de lo convencional. En un sector donde los cambios tecnológicos son rápidos y constantes, este tipo de liderazgo fomenta una cultura organizacional que valora la adaptación y la evolución continua. Los líderes transformacionales alientan a los miembros de su equipo a proponer nuevas ideas, experimentar y adoptar nuevas tecnologías sin temor al fracaso, lo cual es crucial para impulsar la innovación dentro de la empresa.</w:t>
       </w:r>
     </w:p>
     <w:p>
@@ -2755,7 +2782,6 @@
           <w:sz w:val="24"/>
           <w:szCs w:val="24"/>
         </w:rPr>
-        <w:lastRenderedPageBreak/>
         <w:t>Delegación efectiva y confianza:</w:t>
       </w:r>
       <w:r>
@@ -2861,11 +2887,7 @@
         <w:t>: l</w:t>
       </w:r>
       <w:r>
-        <w:t xml:space="preserve">a informática es un campo sujeto a incertidumbres (ciberseguridad, fallas técnicas, cambios en la infraestructura, etc.). El gerente debe estar </w:t>
-      </w:r>
-      <w:r>
-        <w:lastRenderedPageBreak/>
-        <w:t>preparado para anticipar escenarios, valorar riesgos y tomar decisiones que minimicen impactos negativos para la organización y el personal.</w:t>
+        <w:t>a informática es un campo sujeto a incertidumbres (ciberseguridad, fallas técnicas, cambios en la infraestructura, etc.). El gerente debe estar preparado para anticipar escenarios, valorar riesgos y tomar decisiones que minimicen impactos negativos para la organización y el personal.</w:t>
       </w:r>
     </w:p>
     <w:p>
@@ -3021,6 +3043,7 @@
           <w:b w:val="0"/>
           <w:bCs w:val="0"/>
         </w:rPr>
+        <w:lastRenderedPageBreak/>
         <w:t>6. Flexibilidad y adaptabilidad</w:t>
       </w:r>
       <w:r>
@@ -3280,7 +3303,43 @@
           <w:szCs w:val="24"/>
           <w:lang w:eastAsia="es-VE"/>
         </w:rPr>
-        <w:t xml:space="preserve">en un entorno digital cada vez más interconectado y vulnerable a las ciberamenazas, la seguridad de la información se ha convertido en una necesidad primordial. La protección de los datos institucionales y personales de los usuarios no solo es esencial para mantener la confidencialidad, integridad y disponibilidad de la información, sino también para cumplir con normativas legales y éticas que rigen el manejo de datos sensibles. Los incidentes de seguridad, como los ataques cibernéticos, la filtración de datos o el robo de información, pueden tener consecuencias devastadoras, tanto en términos de reputación como de consecuencias legales. Por ello, la gerencia informática debe garantizar la implementación de políticas de seguridad sólidas, tales como cifrado de datos, autenticación multifactor, monitoreo constante y la adopción de protocolos de respuesta ante incidentes. La capacitación continua en temas de seguridad </w:t>
+        <w:t xml:space="preserve">en un entorno digital cada vez más interconectado y vulnerable a las </w:t>
+      </w:r>
+      <w:proofErr w:type="spellStart"/>
+      <w:r>
+        <w:rPr>
+          <w:rFonts w:eastAsia="Times New Roman" w:cs="Times New Roman"/>
+          <w:szCs w:val="24"/>
+          <w:lang w:eastAsia="es-VE"/>
+        </w:rPr>
+        <w:t>ciberamenazas</w:t>
+      </w:r>
+      <w:proofErr w:type="spellEnd"/>
+      <w:r>
+        <w:rPr>
+          <w:rFonts w:eastAsia="Times New Roman" w:cs="Times New Roman"/>
+          <w:szCs w:val="24"/>
+          <w:lang w:eastAsia="es-VE"/>
+        </w:rPr>
+        <w:t xml:space="preserve">, la seguridad de la información se ha convertido en una necesidad primordial. La protección de los datos institucionales y personales de los usuarios no solo es esencial para mantener la confidencialidad, integridad y disponibilidad de la información, sino también para cumplir con normativas legales y éticas que rigen el manejo de datos sensibles. Los incidentes de seguridad, como los ataques cibernéticos, la filtración de datos o el robo de información, pueden tener consecuencias devastadoras, tanto en términos de reputación como de consecuencias legales. Por ello, la gerencia informática debe garantizar la implementación de políticas de seguridad sólidas, tales como cifrado de datos, autenticación </w:t>
+      </w:r>
+      <w:proofErr w:type="spellStart"/>
+      <w:r>
+        <w:rPr>
+          <w:rFonts w:eastAsia="Times New Roman" w:cs="Times New Roman"/>
+          <w:szCs w:val="24"/>
+          <w:lang w:eastAsia="es-VE"/>
+        </w:rPr>
+        <w:t>multifactor</w:t>
+      </w:r>
+      <w:proofErr w:type="spellEnd"/>
+      <w:r>
+        <w:rPr>
+          <w:rFonts w:eastAsia="Times New Roman" w:cs="Times New Roman"/>
+          <w:szCs w:val="24"/>
+          <w:lang w:eastAsia="es-VE"/>
+        </w:rPr>
+        <w:t xml:space="preserve">, monitoreo constante y la adopción de protocolos de respuesta ante incidentes. La capacitación continua en temas de seguridad </w:t>
       </w:r>
       <w:r>
         <w:rPr>
@@ -3369,7 +3428,61 @@
           <w:szCs w:val="24"/>
           <w:lang w:eastAsia="es-VE"/>
         </w:rPr>
-        <w:t>la rápida evolución de las TIC exige que las organizaciones estén preparadas para adaptarse a los cambios. Nuevas tecnologías, como la inteligencia artificial (IA), el internet de las cosas (IoT), el blockchain, la computación en la nube y otras innovaciones, están reconfigurando la manera en que las empresas operan. La gerencia informática debe tener la capacidad para evaluar e integrar estas tecnologías de manera estratégica, garantizando que las implementaciones se realicen de forma eficiente y escalable. La integración de nuevas tecnologías no solo mejora la competitividad, sino que también impulsa la eficiencia operativa y reduce los costos a largo plazo. Esto también puede significar una optimización de los recursos humanos a través de la automatización de tareas repetitivas y una mejora en la calidad del servicio al cliente mediante la implementación de herramientas de inteligencia artificial o chatbots. La flexibilidad para adaptar las infraestructuras y los procesos de negocio a nuevas tendencias es un elemento clave en la sostenibilidad y el crecimiento continuo de la organización.</w:t>
+        <w:t>la rápida evolución de las TIC exige que las organizaciones estén preparadas para adaptarse a los cambios. Nuevas tecnologías, como la inteligencia artificial (IA), el internet de las cosas (</w:t>
+      </w:r>
+      <w:proofErr w:type="spellStart"/>
+      <w:r>
+        <w:rPr>
+          <w:rFonts w:eastAsia="Times New Roman" w:cs="Times New Roman"/>
+          <w:szCs w:val="24"/>
+          <w:lang w:eastAsia="es-VE"/>
+        </w:rPr>
+        <w:t>IoT</w:t>
+      </w:r>
+      <w:proofErr w:type="spellEnd"/>
+      <w:r>
+        <w:rPr>
+          <w:rFonts w:eastAsia="Times New Roman" w:cs="Times New Roman"/>
+          <w:szCs w:val="24"/>
+          <w:lang w:eastAsia="es-VE"/>
+        </w:rPr>
+        <w:t xml:space="preserve">), el </w:t>
+      </w:r>
+      <w:proofErr w:type="spellStart"/>
+      <w:r>
+        <w:rPr>
+          <w:rFonts w:eastAsia="Times New Roman" w:cs="Times New Roman"/>
+          <w:szCs w:val="24"/>
+          <w:lang w:eastAsia="es-VE"/>
+        </w:rPr>
+        <w:t>blockchain</w:t>
+      </w:r>
+      <w:proofErr w:type="spellEnd"/>
+      <w:r>
+        <w:rPr>
+          <w:rFonts w:eastAsia="Times New Roman" w:cs="Times New Roman"/>
+          <w:szCs w:val="24"/>
+          <w:lang w:eastAsia="es-VE"/>
+        </w:rPr>
+        <w:t xml:space="preserve">, la computación en la nube y otras innovaciones, están reconfigurando la manera en que las empresas operan. La gerencia informática debe tener la capacidad para evaluar e integrar estas tecnologías de manera estratégica, garantizando que las implementaciones se realicen de forma eficiente y escalable. La integración de nuevas tecnologías no solo mejora la competitividad, sino que también impulsa la eficiencia operativa y reduce los costos a largo plazo. Esto también puede significar una optimización de los recursos humanos a través de la automatización de tareas repetitivas y una mejora en la calidad del servicio al cliente mediante la implementación de herramientas de inteligencia artificial o </w:t>
+      </w:r>
+      <w:proofErr w:type="spellStart"/>
+      <w:r>
+        <w:rPr>
+          <w:rFonts w:eastAsia="Times New Roman" w:cs="Times New Roman"/>
+          <w:szCs w:val="24"/>
+          <w:lang w:eastAsia="es-VE"/>
+        </w:rPr>
+        <w:t>chatbots</w:t>
+      </w:r>
+      <w:proofErr w:type="spellEnd"/>
+      <w:r>
+        <w:rPr>
+          <w:rFonts w:eastAsia="Times New Roman" w:cs="Times New Roman"/>
+          <w:szCs w:val="24"/>
+          <w:lang w:eastAsia="es-VE"/>
+        </w:rPr>
+        <w:t>. La flexibilidad para adaptar las infraestructuras y los procesos de negocio a nuevas tendencias es un elemento clave en la sostenibilidad y el crecimiento continuo de la organización.</w:t>
       </w:r>
     </w:p>
     <w:p>
@@ -3460,7 +3573,25 @@
           <w:szCs w:val="24"/>
           <w:lang w:eastAsia="es-VE"/>
         </w:rPr>
-        <w:t>las empresas también enfrentan la necesidad de mejorar constantemente la experiencia del usuario (UX), ya sea para los clientes, empleados o stakeholders. La gerencia informática debe velar por el diseño, implementación y mantenimiento de interfaces amigables y funcionales, tanto para el uso interno (sistemas de gestión, plataformas colaborativas, etc.) como para la interacción con clientes externos (portales web, aplicaciones móviles, servicios en línea). Este enfoque mejora la satisfacción de los usuarios y promueve una mayor adopción de las soluciones tecnológicas implementadas, lo que se traduce en un mayor compromiso y fidelidad tanto del cliente como del empleado.</w:t>
+        <w:t xml:space="preserve">las empresas también enfrentan la necesidad de mejorar constantemente la experiencia del usuario (UX), ya sea para los clientes, empleados o </w:t>
+      </w:r>
+      <w:proofErr w:type="spellStart"/>
+      <w:r>
+        <w:rPr>
+          <w:rFonts w:eastAsia="Times New Roman" w:cs="Times New Roman"/>
+          <w:szCs w:val="24"/>
+          <w:lang w:eastAsia="es-VE"/>
+        </w:rPr>
+        <w:t>stakeholders</w:t>
+      </w:r>
+      <w:proofErr w:type="spellEnd"/>
+      <w:r>
+        <w:rPr>
+          <w:rFonts w:eastAsia="Times New Roman" w:cs="Times New Roman"/>
+          <w:szCs w:val="24"/>
+          <w:lang w:eastAsia="es-VE"/>
+        </w:rPr>
+        <w:t>. La gerencia informática debe velar por el diseño, implementación y mantenimiento de interfaces amigables y funcionales, tanto para el uso interno (sistemas de gestión, plataformas colaborativas, etc.) como para la interacción con clientes externos (portales web, aplicaciones móviles, servicios en línea). Este enfoque mejora la satisfacción de los usuarios y promueve una mayor adopción de las soluciones tecnológicas implementadas, lo que se traduce en un mayor compromiso y fidelidad tanto del cliente como del empleado.</w:t>
       </w:r>
     </w:p>
     <w:p>
@@ -4338,7 +4469,27 @@
           <w:szCs w:val="28"/>
           <w:lang w:eastAsia="es-VE"/>
         </w:rPr>
-        <w:t>ara cumplir con las regulaciones gubernamentales, la gerencia informática debe desarrollar e implementar políticas internas robustas que aborden aspectos cruciales como la seguridad de la información, el acceso a los sistemas y la protección de datos sensibles. Estas políticas deben ser claras, específicas y adaptadas a las necesidades particulares de la organización, incluyendo medidas como el uso de autenticación multifactor, la encriptación de datos, y la gestión de accesos y permisos dentro de los sistemas informáticos. Además, es fundamental que estas políticas sean actualizadas de manera constante para reflejar cambios en las leyes o en las amenazas cibernéticas. Los empleados deben ser capacitados para cumplir con estas políticas y se deben realizar seguimientos para verificar que se están implementando correctamente, reduciendo así la probabilidad de infracciones o violaciones.</w:t>
+        <w:t xml:space="preserve">ara cumplir con las regulaciones gubernamentales, la gerencia informática debe desarrollar e implementar políticas internas robustas que aborden aspectos cruciales como la seguridad de la información, el acceso a los sistemas y la protección de datos sensibles. Estas políticas deben ser claras, específicas y adaptadas a las necesidades particulares de la organización, incluyendo medidas como el uso de autenticación </w:t>
+      </w:r>
+      <w:proofErr w:type="spellStart"/>
+      <w:r>
+        <w:rPr>
+          <w:rFonts w:ascii="Times New Roman" w:eastAsia="Times New Roman" w:hAnsi="Times New Roman" w:cs="Times New Roman"/>
+          <w:sz w:val="24"/>
+          <w:szCs w:val="28"/>
+          <w:lang w:eastAsia="es-VE"/>
+        </w:rPr>
+        <w:t>multifactor</w:t>
+      </w:r>
+      <w:proofErr w:type="spellEnd"/>
+      <w:r>
+        <w:rPr>
+          <w:rFonts w:ascii="Times New Roman" w:eastAsia="Times New Roman" w:hAnsi="Times New Roman" w:cs="Times New Roman"/>
+          <w:sz w:val="24"/>
+          <w:szCs w:val="28"/>
+          <w:lang w:eastAsia="es-VE"/>
+        </w:rPr>
+        <w:t>, la encriptación de datos, y la gestión de accesos y permisos dentro de los sistemas informáticos. Además, es fundamental que estas políticas sean actualizadas de manera constante para reflejar cambios en las leyes o en las amenazas cibernéticas. Los empleados deben ser capacitados para cumplir con estas políticas y se deben realizar seguimientos para verificar que se están implementando correctamente, reduciendo así la probabilidad de infracciones o violaciones.</w:t>
       </w:r>
     </w:p>
     <w:p>

</xml_diff>